<commit_message>
clean code file updated: type vs.functionality
</commit_message>
<xml_diff>
--- a/Flutter Clean Code.docx
+++ b/Flutter Clean Code.docx
@@ -29,6 +29,9 @@
         <w:ind w:left="720"/>
       </w:pPr>
       <w:r>
+        <w:rPr>
+          <w:noProof/>
+        </w:rPr>
         <w:drawing>
           <wp:inline distT="0" distB="0" distL="0" distR="0" wp14:anchorId="6117A7E2" wp14:editId="6390699B">
             <wp:extent cx="4020111" cy="1810003"/>
@@ -102,15 +105,7 @@
         <w:t xml:space="preserve">Single Responsibility Principle (SRP): </w:t>
       </w:r>
       <w:r>
-        <w:t xml:space="preserve">A single class/function should be responsible for a single functionality only and should not be responsible for multiple tasks. For </w:t>
-      </w:r>
-      <w:proofErr w:type="gramStart"/>
-      <w:r>
-        <w:t>example</w:t>
-      </w:r>
-      <w:proofErr w:type="gramEnd"/>
-      <w:r>
-        <w:t xml:space="preserve"> </w:t>
+        <w:t xml:space="preserve">A single class/function should be responsible for a single functionality only and should not be responsible for multiple tasks. For example </w:t>
       </w:r>
       <w:r>
         <w:t>separating UI components, business logic, and data access logic into separate classes.</w:t>
@@ -121,6 +116,9 @@
         <w:pStyle w:val="ListParagraph"/>
       </w:pPr>
       <w:r>
+        <w:rPr>
+          <w:noProof/>
+        </w:rPr>
         <w:lastRenderedPageBreak/>
         <w:drawing>
           <wp:inline distT="0" distB="0" distL="0" distR="0" wp14:anchorId="7AFAFE13" wp14:editId="218FD8F8">
@@ -159,6 +157,9 @@
         </w:drawing>
       </w:r>
       <w:r>
+        <w:rPr>
+          <w:noProof/>
+        </w:rPr>
         <w:lastRenderedPageBreak/>
         <w:drawing>
           <wp:inline distT="0" distB="0" distL="0" distR="0" wp14:anchorId="1E0B7904" wp14:editId="152DF111">
@@ -197,52 +198,31 @@
         </w:drawing>
       </w:r>
       <w:r>
-        <w:t xml:space="preserve"> In this example, it may seem that SRP overcomplicates </w:t>
-      </w:r>
-      <w:proofErr w:type="gramStart"/>
-      <w:r>
-        <w:t>code</w:t>
-      </w:r>
-      <w:proofErr w:type="gramEnd"/>
-      <w:r>
-        <w:t xml:space="preserve"> but this is a simple example. SRP makes scaling easier and is also helpful when you have multiple screens/components that need to access the same business logic or modify the same data. It’s also helpful when you need to change where your data is coming from or add business logic without messing up the other parts. </w:t>
-      </w:r>
-    </w:p>
-    <w:p>
-      <w:pPr>
-        <w:pStyle w:val="ListParagraph"/>
-      </w:pPr>
-      <w:r>
-        <w:t xml:space="preserve">In flutter state management solutions like provider and </w:t>
-      </w:r>
-      <w:proofErr w:type="gramStart"/>
-      <w:r>
-        <w:t>bloc</w:t>
-      </w:r>
-      <w:proofErr w:type="gramEnd"/>
-      <w:r>
-        <w:t xml:space="preserve"> can be used to enforce SRP. </w:t>
-      </w:r>
-    </w:p>
-    <w:p>
-      <w:pPr>
-        <w:pStyle w:val="ListParagraph"/>
-      </w:pPr>
-      <w:r>
-        <w:t xml:space="preserve">For </w:t>
-      </w:r>
-      <w:proofErr w:type="gramStart"/>
-      <w:r>
-        <w:t>example</w:t>
-      </w:r>
-      <w:proofErr w:type="gramEnd"/>
-      <w:r>
-        <w:t xml:space="preserve"> provider can be used to separate business logic</w:t>
+        <w:t xml:space="preserve"> In this example, it may seem that SRP overcomplicates code but this is a simple example. SRP makes scaling easier and is also helpful when you have multiple screens/components that need to access the same business logic or modify the same data. It’s also helpful when you need to change where your data is coming from or add business logic without messing up the other parts. </w:t>
+      </w:r>
+    </w:p>
+    <w:p>
+      <w:pPr>
+        <w:pStyle w:val="ListParagraph"/>
+      </w:pPr>
+      <w:r>
+        <w:t xml:space="preserve">In flutter state management solutions like provider and bloc can be used to enforce SRP. </w:t>
+      </w:r>
+    </w:p>
+    <w:p>
+      <w:pPr>
+        <w:pStyle w:val="ListParagraph"/>
+      </w:pPr>
+      <w:r>
+        <w:t>For example provider can be used to separate business logic</w:t>
       </w:r>
       <w:r>
         <w:t xml:space="preserve"> like so: </w:t>
       </w:r>
       <w:r>
+        <w:rPr>
+          <w:noProof/>
+        </w:rPr>
         <w:drawing>
           <wp:inline distT="0" distB="0" distL="0" distR="0" wp14:anchorId="3A717459" wp14:editId="204780CD">
             <wp:extent cx="5943600" cy="2514600"/>
@@ -280,6 +260,9 @@
         </w:drawing>
       </w:r>
       <w:r>
+        <w:rPr>
+          <w:noProof/>
+        </w:rPr>
         <w:lastRenderedPageBreak/>
         <w:drawing>
           <wp:inline distT="0" distB="0" distL="0" distR="0" wp14:anchorId="17EFBDA5" wp14:editId="18CE410E">
@@ -318,6 +301,9 @@
         </w:drawing>
       </w:r>
       <w:r>
+        <w:rPr>
+          <w:noProof/>
+        </w:rPr>
         <w:drawing>
           <wp:inline distT="0" distB="0" distL="0" distR="0" wp14:anchorId="6876B739" wp14:editId="2BE68462">
             <wp:extent cx="5943600" cy="2580005"/>
@@ -389,6 +375,9 @@
         <w:pStyle w:val="ListParagraph"/>
       </w:pPr>
       <w:r>
+        <w:rPr>
+          <w:noProof/>
+        </w:rPr>
         <w:lastRenderedPageBreak/>
         <w:drawing>
           <wp:inline distT="0" distB="0" distL="0" distR="0" wp14:anchorId="5783D02D" wp14:editId="049B5A31">
@@ -457,11 +446,296 @@
     <w:p>
       <w:pPr>
         <w:pStyle w:val="ListParagraph"/>
-        <w:numPr>
-          <w:ilvl w:val="0"/>
-          <w:numId w:val="1"/>
-        </w:numPr>
-      </w:pPr>
+      </w:pPr>
+    </w:p>
+    <w:p>
+      <w:pPr>
+        <w:pStyle w:val="ListParagraph"/>
+      </w:pPr>
+    </w:p>
+    <w:p>
+      <w:pPr>
+        <w:pStyle w:val="ListParagraph"/>
+      </w:pPr>
+    </w:p>
+    <w:p>
+      <w:pPr>
+        <w:pStyle w:val="ListParagraph"/>
+      </w:pPr>
+    </w:p>
+    <w:p>
+      <w:pPr>
+        <w:pStyle w:val="ListParagraph"/>
+      </w:pPr>
+    </w:p>
+    <w:p>
+      <w:pPr>
+        <w:pStyle w:val="ListParagraph"/>
+      </w:pPr>
+    </w:p>
+    <w:p>
+      <w:pPr>
+        <w:pStyle w:val="ListParagraph"/>
+      </w:pPr>
+    </w:p>
+    <w:p>
+      <w:pPr>
+        <w:pStyle w:val="ListParagraph"/>
+      </w:pPr>
+    </w:p>
+    <w:p>
+      <w:pPr>
+        <w:pStyle w:val="ListParagraph"/>
+      </w:pPr>
+    </w:p>
+    <w:p>
+      <w:pPr>
+        <w:pStyle w:val="ListParagraph"/>
+      </w:pPr>
+    </w:p>
+    <w:p>
+      <w:pPr>
+        <w:pStyle w:val="ListParagraph"/>
+      </w:pPr>
+    </w:p>
+    <w:p>
+      <w:pPr>
+        <w:pStyle w:val="ListParagraph"/>
+      </w:pPr>
+    </w:p>
+    <w:p>
+      <w:pPr>
+        <w:pStyle w:val="ListParagraph"/>
+      </w:pPr>
+    </w:p>
+    <w:p>
+      <w:pPr>
+        <w:pStyle w:val="ListParagraph"/>
+      </w:pPr>
+    </w:p>
+    <w:p>
+      <w:pPr>
+        <w:pStyle w:val="ListParagraph"/>
+      </w:pPr>
+    </w:p>
+    <w:p>
+      <w:pPr>
+        <w:pStyle w:val="ListParagraph"/>
+      </w:pPr>
+    </w:p>
+    <w:p>
+      <w:pPr>
+        <w:pStyle w:val="ListParagraph"/>
+      </w:pPr>
+    </w:p>
+    <w:p>
+      <w:pPr>
+        <w:pStyle w:val="ListParagraph"/>
+      </w:pPr>
+    </w:p>
+    <w:p>
+      <w:pPr>
+        <w:pStyle w:val="ListParagraph"/>
+      </w:pPr>
+    </w:p>
+    <w:p>
+      <w:pPr>
+        <w:pStyle w:val="ListParagraph"/>
+      </w:pPr>
+    </w:p>
+    <w:p>
+      <w:pPr>
+        <w:pStyle w:val="ListParagraph"/>
+      </w:pPr>
+    </w:p>
+    <w:p>
+      <w:pPr>
+        <w:pStyle w:val="ListParagraph"/>
+        <w:rPr>
+          <w:b/>
+          <w:bCs/>
+          <w:sz w:val="28"/>
+          <w:szCs w:val="28"/>
+        </w:rPr>
+      </w:pPr>
+      <w:r>
+        <w:rPr>
+          <w:b/>
+          <w:bCs/>
+          <w:sz w:val="28"/>
+          <w:szCs w:val="28"/>
+        </w:rPr>
+        <w:lastRenderedPageBreak/>
+        <w:t>ORGANIZATION OF FLUTTER CODE BY TYPE VS. BY FUNCTIONALITY</w:t>
+      </w:r>
+    </w:p>
+    <w:p>
+      <w:pPr>
+        <w:pStyle w:val="ListParagraph"/>
+        <w:rPr>
+          <w:b/>
+          <w:bCs/>
+          <w:sz w:val="28"/>
+          <w:szCs w:val="28"/>
+        </w:rPr>
+      </w:pPr>
+    </w:p>
+    <w:p>
+      <w:pPr>
+        <w:pStyle w:val="ListParagraph"/>
+      </w:pPr>
+      <w:r>
+        <w:lastRenderedPageBreak/>
+        <w:drawing>
+          <wp:inline distT="0" distB="0" distL="0" distR="0" wp14:anchorId="7B53BCB6" wp14:editId="23348416">
+            <wp:extent cx="5943600" cy="7026275"/>
+            <wp:effectExtent l="0" t="0" r="0" b="3175"/>
+            <wp:docPr id="486697492" name="Picture 1"/>
+            <wp:cNvGraphicFramePr>
+              <a:graphicFrameLocks xmlns:a="http://schemas.openxmlformats.org/drawingml/2006/main" noChangeAspect="1"/>
+            </wp:cNvGraphicFramePr>
+            <a:graphic xmlns:a="http://schemas.openxmlformats.org/drawingml/2006/main">
+              <a:graphicData uri="http://schemas.openxmlformats.org/drawingml/2006/picture">
+                <pic:pic xmlns:pic="http://schemas.openxmlformats.org/drawingml/2006/picture">
+                  <pic:nvPicPr>
+                    <pic:cNvPr id="486697492" name=""/>
+                    <pic:cNvPicPr/>
+                  </pic:nvPicPr>
+                  <pic:blipFill>
+                    <a:blip r:embed="rId12"/>
+                    <a:stretch>
+                      <a:fillRect/>
+                    </a:stretch>
+                  </pic:blipFill>
+                  <pic:spPr>
+                    <a:xfrm>
+                      <a:off x="0" y="0"/>
+                      <a:ext cx="5943600" cy="7026275"/>
+                    </a:xfrm>
+                    <a:prstGeom prst="rect">
+                      <a:avLst/>
+                    </a:prstGeom>
+                  </pic:spPr>
+                </pic:pic>
+              </a:graphicData>
+            </a:graphic>
+          </wp:inline>
+        </w:drawing>
+      </w:r>
+      <w:r>
+        <w:lastRenderedPageBreak/>
+        <w:drawing>
+          <wp:inline distT="0" distB="0" distL="0" distR="0" wp14:anchorId="6FF6009C" wp14:editId="61A0187E">
+            <wp:extent cx="5943600" cy="2811780"/>
+            <wp:effectExtent l="0" t="0" r="0" b="7620"/>
+            <wp:docPr id="2030459300" name="Picture 1" descr="A black screen with white text&#10;&#10;Description automatically generated"/>
+            <wp:cNvGraphicFramePr>
+              <a:graphicFrameLocks xmlns:a="http://schemas.openxmlformats.org/drawingml/2006/main" noChangeAspect="1"/>
+            </wp:cNvGraphicFramePr>
+            <a:graphic xmlns:a="http://schemas.openxmlformats.org/drawingml/2006/main">
+              <a:graphicData uri="http://schemas.openxmlformats.org/drawingml/2006/picture">
+                <pic:pic xmlns:pic="http://schemas.openxmlformats.org/drawingml/2006/picture">
+                  <pic:nvPicPr>
+                    <pic:cNvPr id="2030459300" name="Picture 1" descr="A black screen with white text&#10;&#10;Description automatically generated"/>
+                    <pic:cNvPicPr/>
+                  </pic:nvPicPr>
+                  <pic:blipFill>
+                    <a:blip r:embed="rId13"/>
+                    <a:stretch>
+                      <a:fillRect/>
+                    </a:stretch>
+                  </pic:blipFill>
+                  <pic:spPr>
+                    <a:xfrm>
+                      <a:off x="0" y="0"/>
+                      <a:ext cx="5943600" cy="2811780"/>
+                    </a:xfrm>
+                    <a:prstGeom prst="rect">
+                      <a:avLst/>
+                    </a:prstGeom>
+                  </pic:spPr>
+                </pic:pic>
+              </a:graphicData>
+            </a:graphic>
+          </wp:inline>
+        </w:drawing>
+      </w:r>
+      <w:r>
+        <w:lastRenderedPageBreak/>
+        <w:drawing>
+          <wp:inline distT="0" distB="0" distL="0" distR="0" wp14:anchorId="62DF60DC" wp14:editId="0BE986A9">
+            <wp:extent cx="5943600" cy="6743700"/>
+            <wp:effectExtent l="0" t="0" r="0" b="0"/>
+            <wp:docPr id="829053422" name="Picture 1" descr="A screenshot of a computer program&#10;&#10;Description automatically generated"/>
+            <wp:cNvGraphicFramePr>
+              <a:graphicFrameLocks xmlns:a="http://schemas.openxmlformats.org/drawingml/2006/main" noChangeAspect="1"/>
+            </wp:cNvGraphicFramePr>
+            <a:graphic xmlns:a="http://schemas.openxmlformats.org/drawingml/2006/main">
+              <a:graphicData uri="http://schemas.openxmlformats.org/drawingml/2006/picture">
+                <pic:pic xmlns:pic="http://schemas.openxmlformats.org/drawingml/2006/picture">
+                  <pic:nvPicPr>
+                    <pic:cNvPr id="829053422" name="Picture 1" descr="A screenshot of a computer program&#10;&#10;Description automatically generated"/>
+                    <pic:cNvPicPr/>
+                  </pic:nvPicPr>
+                  <pic:blipFill>
+                    <a:blip r:embed="rId14"/>
+                    <a:stretch>
+                      <a:fillRect/>
+                    </a:stretch>
+                  </pic:blipFill>
+                  <pic:spPr>
+                    <a:xfrm>
+                      <a:off x="0" y="0"/>
+                      <a:ext cx="5943600" cy="6743700"/>
+                    </a:xfrm>
+                    <a:prstGeom prst="rect">
+                      <a:avLst/>
+                    </a:prstGeom>
+                  </pic:spPr>
+                </pic:pic>
+              </a:graphicData>
+            </a:graphic>
+          </wp:inline>
+        </w:drawing>
+      </w:r>
+      <w:r>
+        <w:lastRenderedPageBreak/>
+        <w:drawing>
+          <wp:inline distT="0" distB="0" distL="0" distR="0" wp14:anchorId="3C9234C0" wp14:editId="0BF036D3">
+            <wp:extent cx="5943600" cy="4521835"/>
+            <wp:effectExtent l="0" t="0" r="0" b="0"/>
+            <wp:docPr id="639347530" name="Picture 1" descr="A screenshot of a computer program&#10;&#10;Description automatically generated"/>
+            <wp:cNvGraphicFramePr>
+              <a:graphicFrameLocks xmlns:a="http://schemas.openxmlformats.org/drawingml/2006/main" noChangeAspect="1"/>
+            </wp:cNvGraphicFramePr>
+            <a:graphic xmlns:a="http://schemas.openxmlformats.org/drawingml/2006/main">
+              <a:graphicData uri="http://schemas.openxmlformats.org/drawingml/2006/picture">
+                <pic:pic xmlns:pic="http://schemas.openxmlformats.org/drawingml/2006/picture">
+                  <pic:nvPicPr>
+                    <pic:cNvPr id="639347530" name="Picture 1" descr="A screenshot of a computer program&#10;&#10;Description automatically generated"/>
+                    <pic:cNvPicPr/>
+                  </pic:nvPicPr>
+                  <pic:blipFill>
+                    <a:blip r:embed="rId15"/>
+                    <a:stretch>
+                      <a:fillRect/>
+                    </a:stretch>
+                  </pic:blipFill>
+                  <pic:spPr>
+                    <a:xfrm>
+                      <a:off x="0" y="0"/>
+                      <a:ext cx="5943600" cy="4521835"/>
+                    </a:xfrm>
+                    <a:prstGeom prst="rect">
+                      <a:avLst/>
+                    </a:prstGeom>
+                  </pic:spPr>
+                </pic:pic>
+              </a:graphicData>
+            </a:graphic>
+          </wp:inline>
+        </w:drawing>
+      </w:r>
     </w:p>
     <w:sectPr>
       <w:pgSz w:w="12240" w:h="15840"/>
@@ -1173,6 +1447,7 @@
   <w:style w:type="character" w:default="1" w:styleId="DefaultParagraphFont">
     <w:name w:val="Default Paragraph Font"/>
     <w:uiPriority w:val="1"/>
+    <w:semiHidden/>
     <w:unhideWhenUsed/>
   </w:style>
   <w:style w:type="table" w:default="1" w:styleId="TableNormal">

</xml_diff>